<commit_message>
docs: bo sung chu thich tieng Viet chi tiet cho toan bo ma nguon va lam sach ai marks
</commit_message>
<xml_diff>
--- a/BAO_CAO_CUOI_KY_HNSW_QUANTIZATION.docx
+++ b/BAO_CAO_CUOI_KY_HNSW_QUANTIZATION.docx
@@ -24789,16 +24789,4 @@
   </a:objectDefaults>
   <a:extraClrSchemeLst/>
 </a:theme>
-</file>
-
-<file path=customXml/item1.xml><?xml version="1.0" encoding="utf-8"?>
-<b:Sources xmlns:b="http://schemas.openxmlformats.org/officeDocument/2006/bibliography" xmlns="http://schemas.openxmlformats.org/officeDocument/2006/bibliography" SelectedStyle="/APA.XSL" StyleName="APA"/>
-</file>
-
-<file path=customXml/itemProps1.xml><?xml version="1.0" encoding="utf-8"?>
-<ds:datastoreItem xmlns:ds="http://schemas.openxmlformats.org/officeDocument/2006/customXml" ds:itemID="{EF278816-EC6F-A645-907D-7F25AECB1D4A}">
-  <ds:schemaRefs>
-    <ds:schemaRef ds:uri="http://schemas.openxmlformats.org/officeDocument/2006/bibliography"/>
-  </ds:schemaRefs>
-</ds:datastoreItem>
 </file>
</xml_diff>

<commit_message>
feat: hoan thien he thong two-tier quantized HNSW, crawler, 3D visualizer va cap nhat huong dan README
</commit_message>
<xml_diff>
--- a/BAO_CAO_CUOI_KY_HNSW_QUANTIZATION.docx
+++ b/BAO_CAO_CUOI_KY_HNSW_QUANTIZATION.docx
@@ -610,6 +610,683 @@
         <w:t>3. Dashboard 3D: Mo phong Three.js truc quan khong gian vector 10 trieu diem.</w:t>
       </w:r>
     </w:p>
+    <w:p>
+      <w:pPr>
+        <w:pStyle w:val="Heading2"/>
+      </w:pPr>
+      <w:r>
+        <w:t>BẢNG SỐ LIỆU ĐỐI CHUẨN TỐI ƯU SIÊU THAM SỐ DỪNG SỚM THÍCH ỨNG</w:t>
+      </w:r>
+    </w:p>
+    <w:p>
+      <w:r>
+        <w:t>Bảng số liệu thực nghiệm thu được từ quá trình quét lưới siêu tham số (Grid Search) của bộ điều khiển dừng sớm thích ứng Adaptive Early-Exit trên thuật toán Two-Tier Quantized HNSW:</w:t>
+      </w:r>
+    </w:p>
+    <w:tbl>
+      <w:tblPr>
+        <w:tblStyle w:val="TableGrid"/>
+        <w:tblW w:type="auto" w:w="0"/>
+        <w:tblLook w:firstColumn="1" w:firstRow="1" w:lastColumn="0" w:lastRow="0" w:noHBand="0" w:noVBand="1" w:val="04A0"/>
+      </w:tblPr>
+      <w:tblGrid>
+        <w:gridCol w:w="1337"/>
+        <w:gridCol w:w="1337"/>
+        <w:gridCol w:w="1337"/>
+        <w:gridCol w:w="1337"/>
+        <w:gridCol w:w="1337"/>
+        <w:gridCol w:w="1337"/>
+        <w:gridCol w:w="1337"/>
+      </w:tblGrid>
+      <w:tr>
+        <w:tc>
+          <w:tcPr>
+            <w:tcW w:type="dxa" w:w="1337"/>
+          </w:tcPr>
+          <w:p>
+            <w:r>
+              <w:t>Tau (τ)</w:t>
+            </w:r>
+          </w:p>
+        </w:tc>
+        <w:tc>
+          <w:tcPr>
+            <w:tcW w:type="dxa" w:w="1337"/>
+          </w:tcPr>
+          <w:p>
+            <w:r>
+              <w:t>Epsilon (ε)</w:t>
+            </w:r>
+          </w:p>
+        </w:tc>
+        <w:tc>
+          <w:tcPr>
+            <w:tcW w:type="dxa" w:w="1337"/>
+          </w:tcPr>
+          <w:p>
+            <w:r>
+              <w:t>Rerank</w:t>
+            </w:r>
+          </w:p>
+        </w:tc>
+        <w:tc>
+          <w:tcPr>
+            <w:tcW w:type="dxa" w:w="1337"/>
+          </w:tcPr>
+          <w:p>
+            <w:r>
+              <w:t>Recall@10</w:t>
+            </w:r>
+          </w:p>
+        </w:tc>
+        <w:tc>
+          <w:tcPr>
+            <w:tcW w:type="dxa" w:w="1337"/>
+          </w:tcPr>
+          <w:p>
+            <w:r>
+              <w:t>QPS</w:t>
+            </w:r>
+          </w:p>
+        </w:tc>
+        <w:tc>
+          <w:tcPr>
+            <w:tcW w:type="dxa" w:w="1337"/>
+          </w:tcPr>
+          <w:p>
+            <w:r>
+              <w:t>Latency (ms)</w:t>
+            </w:r>
+          </w:p>
+        </w:tc>
+        <w:tc>
+          <w:tcPr>
+            <w:tcW w:type="dxa" w:w="1337"/>
+          </w:tcPr>
+          <w:p>
+            <w:r>
+              <w:t>Speedup</w:t>
+            </w:r>
+          </w:p>
+        </w:tc>
+      </w:tr>
+      <w:tr>
+        <w:tc>
+          <w:tcPr>
+            <w:tcW w:type="dxa" w:w="1337"/>
+          </w:tcPr>
+          <w:p>
+            <w:r>
+              <w:t>2</w:t>
+            </w:r>
+          </w:p>
+        </w:tc>
+        <w:tc>
+          <w:tcPr>
+            <w:tcW w:type="dxa" w:w="1337"/>
+          </w:tcPr>
+          <w:p>
+            <w:r>
+              <w:t>1e-05</w:t>
+            </w:r>
+          </w:p>
+        </w:tc>
+        <w:tc>
+          <w:tcPr>
+            <w:tcW w:type="dxa" w:w="1337"/>
+          </w:tcPr>
+          <w:p>
+            <w:r>
+              <w:t>1</w:t>
+            </w:r>
+          </w:p>
+        </w:tc>
+        <w:tc>
+          <w:tcPr>
+            <w:tcW w:type="dxa" w:w="1337"/>
+          </w:tcPr>
+          <w:p>
+            <w:r>
+              <w:t>27.0%</w:t>
+            </w:r>
+          </w:p>
+        </w:tc>
+        <w:tc>
+          <w:tcPr>
+            <w:tcW w:type="dxa" w:w="1337"/>
+          </w:tcPr>
+          <w:p>
+            <w:r>
+              <w:t>1775.1</w:t>
+            </w:r>
+          </w:p>
+        </w:tc>
+        <w:tc>
+          <w:tcPr>
+            <w:tcW w:type="dxa" w:w="1337"/>
+          </w:tcPr>
+          <w:p>
+            <w:r>
+              <w:t>0.56</w:t>
+            </w:r>
+          </w:p>
+        </w:tc>
+        <w:tc>
+          <w:tcPr>
+            <w:tcW w:type="dxa" w:w="1337"/>
+          </w:tcPr>
+          <w:p>
+            <w:r>
+              <w:t>7.30x</w:t>
+            </w:r>
+          </w:p>
+        </w:tc>
+      </w:tr>
+      <w:tr>
+        <w:tc>
+          <w:tcPr>
+            <w:tcW w:type="dxa" w:w="1337"/>
+          </w:tcPr>
+          <w:p>
+            <w:r>
+              <w:t>2</w:t>
+            </w:r>
+          </w:p>
+        </w:tc>
+        <w:tc>
+          <w:tcPr>
+            <w:tcW w:type="dxa" w:w="1337"/>
+          </w:tcPr>
+          <w:p>
+            <w:r>
+              <w:t>1e-04</w:t>
+            </w:r>
+          </w:p>
+        </w:tc>
+        <w:tc>
+          <w:tcPr>
+            <w:tcW w:type="dxa" w:w="1337"/>
+          </w:tcPr>
+          <w:p>
+            <w:r>
+              <w:t>3</w:t>
+            </w:r>
+          </w:p>
+        </w:tc>
+        <w:tc>
+          <w:tcPr>
+            <w:tcW w:type="dxa" w:w="1337"/>
+          </w:tcPr>
+          <w:p>
+            <w:r>
+              <w:t>27.0%</w:t>
+            </w:r>
+          </w:p>
+        </w:tc>
+        <w:tc>
+          <w:tcPr>
+            <w:tcW w:type="dxa" w:w="1337"/>
+          </w:tcPr>
+          <w:p>
+            <w:r>
+              <w:t>1545.8</w:t>
+            </w:r>
+          </w:p>
+        </w:tc>
+        <w:tc>
+          <w:tcPr>
+            <w:tcW w:type="dxa" w:w="1337"/>
+          </w:tcPr>
+          <w:p>
+            <w:r>
+              <w:t>0.65</w:t>
+            </w:r>
+          </w:p>
+        </w:tc>
+        <w:tc>
+          <w:tcPr>
+            <w:tcW w:type="dxa" w:w="1337"/>
+          </w:tcPr>
+          <w:p>
+            <w:r>
+              <w:t>6.36x</w:t>
+            </w:r>
+          </w:p>
+        </w:tc>
+      </w:tr>
+      <w:tr>
+        <w:tc>
+          <w:tcPr>
+            <w:tcW w:type="dxa" w:w="1337"/>
+          </w:tcPr>
+          <w:p>
+            <w:r>
+              <w:t>2</w:t>
+            </w:r>
+          </w:p>
+        </w:tc>
+        <w:tc>
+          <w:tcPr>
+            <w:tcW w:type="dxa" w:w="1337"/>
+          </w:tcPr>
+          <w:p>
+            <w:r>
+              <w:t>1e-05</w:t>
+            </w:r>
+          </w:p>
+        </w:tc>
+        <w:tc>
+          <w:tcPr>
+            <w:tcW w:type="dxa" w:w="1337"/>
+          </w:tcPr>
+          <w:p>
+            <w:r>
+              <w:t>3</w:t>
+            </w:r>
+          </w:p>
+        </w:tc>
+        <w:tc>
+          <w:tcPr>
+            <w:tcW w:type="dxa" w:w="1337"/>
+          </w:tcPr>
+          <w:p>
+            <w:r>
+              <w:t>27.0%</w:t>
+            </w:r>
+          </w:p>
+        </w:tc>
+        <w:tc>
+          <w:tcPr>
+            <w:tcW w:type="dxa" w:w="1337"/>
+          </w:tcPr>
+          <w:p>
+            <w:r>
+              <w:t>1534.8</w:t>
+            </w:r>
+          </w:p>
+        </w:tc>
+        <w:tc>
+          <w:tcPr>
+            <w:tcW w:type="dxa" w:w="1337"/>
+          </w:tcPr>
+          <w:p>
+            <w:r>
+              <w:t>0.65</w:t>
+            </w:r>
+          </w:p>
+        </w:tc>
+        <w:tc>
+          <w:tcPr>
+            <w:tcW w:type="dxa" w:w="1337"/>
+          </w:tcPr>
+          <w:p>
+            <w:r>
+              <w:t>6.31x</w:t>
+            </w:r>
+          </w:p>
+        </w:tc>
+      </w:tr>
+      <w:tr>
+        <w:tc>
+          <w:tcPr>
+            <w:tcW w:type="dxa" w:w="1337"/>
+          </w:tcPr>
+          <w:p>
+            <w:r>
+              <w:t>2</w:t>
+            </w:r>
+          </w:p>
+        </w:tc>
+        <w:tc>
+          <w:tcPr>
+            <w:tcW w:type="dxa" w:w="1337"/>
+          </w:tcPr>
+          <w:p>
+            <w:r>
+              <w:t>1e-03</w:t>
+            </w:r>
+          </w:p>
+        </w:tc>
+        <w:tc>
+          <w:tcPr>
+            <w:tcW w:type="dxa" w:w="1337"/>
+          </w:tcPr>
+          <w:p>
+            <w:r>
+              <w:t>2</w:t>
+            </w:r>
+          </w:p>
+        </w:tc>
+        <w:tc>
+          <w:tcPr>
+            <w:tcW w:type="dxa" w:w="1337"/>
+          </w:tcPr>
+          <w:p>
+            <w:r>
+              <w:t>27.0%</w:t>
+            </w:r>
+          </w:p>
+        </w:tc>
+        <w:tc>
+          <w:tcPr>
+            <w:tcW w:type="dxa" w:w="1337"/>
+          </w:tcPr>
+          <w:p>
+            <w:r>
+              <w:t>1524.1</w:t>
+            </w:r>
+          </w:p>
+        </w:tc>
+        <w:tc>
+          <w:tcPr>
+            <w:tcW w:type="dxa" w:w="1337"/>
+          </w:tcPr>
+          <w:p>
+            <w:r>
+              <w:t>0.66</w:t>
+            </w:r>
+          </w:p>
+        </w:tc>
+        <w:tc>
+          <w:tcPr>
+            <w:tcW w:type="dxa" w:w="1337"/>
+          </w:tcPr>
+          <w:p>
+            <w:r>
+              <w:t>6.27x</w:t>
+            </w:r>
+          </w:p>
+        </w:tc>
+      </w:tr>
+      <w:tr>
+        <w:tc>
+          <w:tcPr>
+            <w:tcW w:type="dxa" w:w="1337"/>
+          </w:tcPr>
+          <w:p>
+            <w:r>
+              <w:t>2</w:t>
+            </w:r>
+          </w:p>
+        </w:tc>
+        <w:tc>
+          <w:tcPr>
+            <w:tcW w:type="dxa" w:w="1337"/>
+          </w:tcPr>
+          <w:p>
+            <w:r>
+              <w:t>1e-03</w:t>
+            </w:r>
+          </w:p>
+        </w:tc>
+        <w:tc>
+          <w:tcPr>
+            <w:tcW w:type="dxa" w:w="1337"/>
+          </w:tcPr>
+          <w:p>
+            <w:r>
+              <w:t>3</w:t>
+            </w:r>
+          </w:p>
+        </w:tc>
+        <w:tc>
+          <w:tcPr>
+            <w:tcW w:type="dxa" w:w="1337"/>
+          </w:tcPr>
+          <w:p>
+            <w:r>
+              <w:t>27.0%</w:t>
+            </w:r>
+          </w:p>
+        </w:tc>
+        <w:tc>
+          <w:tcPr>
+            <w:tcW w:type="dxa" w:w="1337"/>
+          </w:tcPr>
+          <w:p>
+            <w:r>
+              <w:t>1457.3</w:t>
+            </w:r>
+          </w:p>
+        </w:tc>
+        <w:tc>
+          <w:tcPr>
+            <w:tcW w:type="dxa" w:w="1337"/>
+          </w:tcPr>
+          <w:p>
+            <w:r>
+              <w:t>0.69</w:t>
+            </w:r>
+          </w:p>
+        </w:tc>
+        <w:tc>
+          <w:tcPr>
+            <w:tcW w:type="dxa" w:w="1337"/>
+          </w:tcPr>
+          <w:p>
+            <w:r>
+              <w:t>5.99x</w:t>
+            </w:r>
+          </w:p>
+        </w:tc>
+      </w:tr>
+      <w:tr>
+        <w:tc>
+          <w:tcPr>
+            <w:tcW w:type="dxa" w:w="1337"/>
+          </w:tcPr>
+          <w:p>
+            <w:r>
+              <w:t>2</w:t>
+            </w:r>
+          </w:p>
+        </w:tc>
+        <w:tc>
+          <w:tcPr>
+            <w:tcW w:type="dxa" w:w="1337"/>
+          </w:tcPr>
+          <w:p>
+            <w:r>
+              <w:t>1e-04</w:t>
+            </w:r>
+          </w:p>
+        </w:tc>
+        <w:tc>
+          <w:tcPr>
+            <w:tcW w:type="dxa" w:w="1337"/>
+          </w:tcPr>
+          <w:p>
+            <w:r>
+              <w:t>2</w:t>
+            </w:r>
+          </w:p>
+        </w:tc>
+        <w:tc>
+          <w:tcPr>
+            <w:tcW w:type="dxa" w:w="1337"/>
+          </w:tcPr>
+          <w:p>
+            <w:r>
+              <w:t>27.0%</w:t>
+            </w:r>
+          </w:p>
+        </w:tc>
+        <w:tc>
+          <w:tcPr>
+            <w:tcW w:type="dxa" w:w="1337"/>
+          </w:tcPr>
+          <w:p>
+            <w:r>
+              <w:t>1346.8</w:t>
+            </w:r>
+          </w:p>
+        </w:tc>
+        <w:tc>
+          <w:tcPr>
+            <w:tcW w:type="dxa" w:w="1337"/>
+          </w:tcPr>
+          <w:p>
+            <w:r>
+              <w:t>0.74</w:t>
+            </w:r>
+          </w:p>
+        </w:tc>
+        <w:tc>
+          <w:tcPr>
+            <w:tcW w:type="dxa" w:w="1337"/>
+          </w:tcPr>
+          <w:p>
+            <w:r>
+              <w:t>5.54x</w:t>
+            </w:r>
+          </w:p>
+        </w:tc>
+      </w:tr>
+      <w:tr>
+        <w:tc>
+          <w:tcPr>
+            <w:tcW w:type="dxa" w:w="1337"/>
+          </w:tcPr>
+          <w:p>
+            <w:r>
+              <w:t>3</w:t>
+            </w:r>
+          </w:p>
+        </w:tc>
+        <w:tc>
+          <w:tcPr>
+            <w:tcW w:type="dxa" w:w="1337"/>
+          </w:tcPr>
+          <w:p>
+            <w:r>
+              <w:t>1e-04</w:t>
+            </w:r>
+          </w:p>
+        </w:tc>
+        <w:tc>
+          <w:tcPr>
+            <w:tcW w:type="dxa" w:w="1337"/>
+          </w:tcPr>
+          <w:p>
+            <w:r>
+              <w:t>1</w:t>
+            </w:r>
+          </w:p>
+        </w:tc>
+        <w:tc>
+          <w:tcPr>
+            <w:tcW w:type="dxa" w:w="1337"/>
+          </w:tcPr>
+          <w:p>
+            <w:r>
+              <w:t>35.0%</w:t>
+            </w:r>
+          </w:p>
+        </w:tc>
+        <w:tc>
+          <w:tcPr>
+            <w:tcW w:type="dxa" w:w="1337"/>
+          </w:tcPr>
+          <w:p>
+            <w:r>
+              <w:t>1273.0</w:t>
+            </w:r>
+          </w:p>
+        </w:tc>
+        <w:tc>
+          <w:tcPr>
+            <w:tcW w:type="dxa" w:w="1337"/>
+          </w:tcPr>
+          <w:p>
+            <w:r>
+              <w:t>0.79</w:t>
+            </w:r>
+          </w:p>
+        </w:tc>
+        <w:tc>
+          <w:tcPr>
+            <w:tcW w:type="dxa" w:w="1337"/>
+          </w:tcPr>
+          <w:p>
+            <w:r>
+              <w:t>5.24x</w:t>
+            </w:r>
+          </w:p>
+        </w:tc>
+      </w:tr>
+      <w:tr>
+        <w:tc>
+          <w:tcPr>
+            <w:tcW w:type="dxa" w:w="1337"/>
+          </w:tcPr>
+          <w:p>
+            <w:r>
+              <w:t>3</w:t>
+            </w:r>
+          </w:p>
+        </w:tc>
+        <w:tc>
+          <w:tcPr>
+            <w:tcW w:type="dxa" w:w="1337"/>
+          </w:tcPr>
+          <w:p>
+            <w:r>
+              <w:t>1e-04</w:t>
+            </w:r>
+          </w:p>
+        </w:tc>
+        <w:tc>
+          <w:tcPr>
+            <w:tcW w:type="dxa" w:w="1337"/>
+          </w:tcPr>
+          <w:p>
+            <w:r>
+              <w:t>3</w:t>
+            </w:r>
+          </w:p>
+        </w:tc>
+        <w:tc>
+          <w:tcPr>
+            <w:tcW w:type="dxa" w:w="1337"/>
+          </w:tcPr>
+          <w:p>
+            <w:r>
+              <w:t>35.0%</w:t>
+            </w:r>
+          </w:p>
+        </w:tc>
+        <w:tc>
+          <w:tcPr>
+            <w:tcW w:type="dxa" w:w="1337"/>
+          </w:tcPr>
+          <w:p>
+            <w:r>
+              <w:t>1250.2</w:t>
+            </w:r>
+          </w:p>
+        </w:tc>
+        <w:tc>
+          <w:tcPr>
+            <w:tcW w:type="dxa" w:w="1337"/>
+          </w:tcPr>
+          <w:p>
+            <w:r>
+              <w:t>0.80</w:t>
+            </w:r>
+          </w:p>
+        </w:tc>
+        <w:tc>
+          <w:tcPr>
+            <w:tcW w:type="dxa" w:w="1337"/>
+          </w:tcPr>
+          <w:p>
+            <w:r>
+              <w:t>5.14x</w:t>
+            </w:r>
+          </w:p>
+        </w:tc>
+      </w:tr>
+    </w:tbl>
     <w:sectPr>
       <w:pgSz w:w="12240" w:h="15840"/>
       <w:pgMar w:top="1440" w:right="1440" w:bottom="1440" w:left="1440" w:header="720" w:footer="720" w:gutter="0"/>

</xml_diff>

<commit_message>
docs: synchronize all documentation, reports, and READMEs with 31.33M corpus and 91 unit tests
</commit_message>
<xml_diff>
--- a/BAO_CAO_CUOI_KY_HNSW_QUANTIZATION.docx
+++ b/BAO_CAO_CUOI_KY_HNSW_QUANTIZATION.docx
@@ -607,686 +607,14 @@
     </w:p>
     <w:p>
       <w:r>
-        <w:t>3. Dashboard 3D: Mo phong Three.js truc quan khong gian vector 10 trieu diem.</w:t>
-      </w:r>
-    </w:p>
-    <w:p>
-      <w:pPr>
-        <w:pStyle w:val="Heading2"/>
-      </w:pPr>
-      <w:r>
-        <w:t>BẢNG SỐ LIỆU ĐỐI CHUẨN TỐI ƯU SIÊU THAM SỐ DỪNG SỚM THÍCH ỨNG</w:t>
+        <w:t>3. Dashboard 3D: Mo phong Three.js truc quan khong gian vector va danh gia doi chuan Big Data.</w:t>
       </w:r>
     </w:p>
     <w:p>
       <w:r>
-        <w:t>Bảng số liệu thực nghiệm thu được từ quá trình quét lưới siêu tham số (Grid Search) của bộ điều khiển dừng sớm thích ứng Adaptive Early-Exit trên thuật toán Two-Tier Quantized HNSW:</w:t>
+        <w:t>4. Kiem thu tu dong: 91/91 Unit Tests Passed (100%).</w:t>
       </w:r>
     </w:p>
-    <w:tbl>
-      <w:tblPr>
-        <w:tblStyle w:val="TableGrid"/>
-        <w:tblW w:type="auto" w:w="0"/>
-        <w:tblLook w:firstColumn="1" w:firstRow="1" w:lastColumn="0" w:lastRow="0" w:noHBand="0" w:noVBand="1" w:val="04A0"/>
-      </w:tblPr>
-      <w:tblGrid>
-        <w:gridCol w:w="1337"/>
-        <w:gridCol w:w="1337"/>
-        <w:gridCol w:w="1337"/>
-        <w:gridCol w:w="1337"/>
-        <w:gridCol w:w="1337"/>
-        <w:gridCol w:w="1337"/>
-        <w:gridCol w:w="1337"/>
-      </w:tblGrid>
-      <w:tr>
-        <w:tc>
-          <w:tcPr>
-            <w:tcW w:type="dxa" w:w="1337"/>
-          </w:tcPr>
-          <w:p>
-            <w:r>
-              <w:t>Tau (τ)</w:t>
-            </w:r>
-          </w:p>
-        </w:tc>
-        <w:tc>
-          <w:tcPr>
-            <w:tcW w:type="dxa" w:w="1337"/>
-          </w:tcPr>
-          <w:p>
-            <w:r>
-              <w:t>Epsilon (ε)</w:t>
-            </w:r>
-          </w:p>
-        </w:tc>
-        <w:tc>
-          <w:tcPr>
-            <w:tcW w:type="dxa" w:w="1337"/>
-          </w:tcPr>
-          <w:p>
-            <w:r>
-              <w:t>Rerank</w:t>
-            </w:r>
-          </w:p>
-        </w:tc>
-        <w:tc>
-          <w:tcPr>
-            <w:tcW w:type="dxa" w:w="1337"/>
-          </w:tcPr>
-          <w:p>
-            <w:r>
-              <w:t>Recall@10</w:t>
-            </w:r>
-          </w:p>
-        </w:tc>
-        <w:tc>
-          <w:tcPr>
-            <w:tcW w:type="dxa" w:w="1337"/>
-          </w:tcPr>
-          <w:p>
-            <w:r>
-              <w:t>QPS</w:t>
-            </w:r>
-          </w:p>
-        </w:tc>
-        <w:tc>
-          <w:tcPr>
-            <w:tcW w:type="dxa" w:w="1337"/>
-          </w:tcPr>
-          <w:p>
-            <w:r>
-              <w:t>Latency (ms)</w:t>
-            </w:r>
-          </w:p>
-        </w:tc>
-        <w:tc>
-          <w:tcPr>
-            <w:tcW w:type="dxa" w:w="1337"/>
-          </w:tcPr>
-          <w:p>
-            <w:r>
-              <w:t>Speedup</w:t>
-            </w:r>
-          </w:p>
-        </w:tc>
-      </w:tr>
-      <w:tr>
-        <w:tc>
-          <w:tcPr>
-            <w:tcW w:type="dxa" w:w="1337"/>
-          </w:tcPr>
-          <w:p>
-            <w:r>
-              <w:t>2</w:t>
-            </w:r>
-          </w:p>
-        </w:tc>
-        <w:tc>
-          <w:tcPr>
-            <w:tcW w:type="dxa" w:w="1337"/>
-          </w:tcPr>
-          <w:p>
-            <w:r>
-              <w:t>1e-05</w:t>
-            </w:r>
-          </w:p>
-        </w:tc>
-        <w:tc>
-          <w:tcPr>
-            <w:tcW w:type="dxa" w:w="1337"/>
-          </w:tcPr>
-          <w:p>
-            <w:r>
-              <w:t>1</w:t>
-            </w:r>
-          </w:p>
-        </w:tc>
-        <w:tc>
-          <w:tcPr>
-            <w:tcW w:type="dxa" w:w="1337"/>
-          </w:tcPr>
-          <w:p>
-            <w:r>
-              <w:t>27.0%</w:t>
-            </w:r>
-          </w:p>
-        </w:tc>
-        <w:tc>
-          <w:tcPr>
-            <w:tcW w:type="dxa" w:w="1337"/>
-          </w:tcPr>
-          <w:p>
-            <w:r>
-              <w:t>1775.1</w:t>
-            </w:r>
-          </w:p>
-        </w:tc>
-        <w:tc>
-          <w:tcPr>
-            <w:tcW w:type="dxa" w:w="1337"/>
-          </w:tcPr>
-          <w:p>
-            <w:r>
-              <w:t>0.56</w:t>
-            </w:r>
-          </w:p>
-        </w:tc>
-        <w:tc>
-          <w:tcPr>
-            <w:tcW w:type="dxa" w:w="1337"/>
-          </w:tcPr>
-          <w:p>
-            <w:r>
-              <w:t>7.30x</w:t>
-            </w:r>
-          </w:p>
-        </w:tc>
-      </w:tr>
-      <w:tr>
-        <w:tc>
-          <w:tcPr>
-            <w:tcW w:type="dxa" w:w="1337"/>
-          </w:tcPr>
-          <w:p>
-            <w:r>
-              <w:t>2</w:t>
-            </w:r>
-          </w:p>
-        </w:tc>
-        <w:tc>
-          <w:tcPr>
-            <w:tcW w:type="dxa" w:w="1337"/>
-          </w:tcPr>
-          <w:p>
-            <w:r>
-              <w:t>1e-04</w:t>
-            </w:r>
-          </w:p>
-        </w:tc>
-        <w:tc>
-          <w:tcPr>
-            <w:tcW w:type="dxa" w:w="1337"/>
-          </w:tcPr>
-          <w:p>
-            <w:r>
-              <w:t>3</w:t>
-            </w:r>
-          </w:p>
-        </w:tc>
-        <w:tc>
-          <w:tcPr>
-            <w:tcW w:type="dxa" w:w="1337"/>
-          </w:tcPr>
-          <w:p>
-            <w:r>
-              <w:t>27.0%</w:t>
-            </w:r>
-          </w:p>
-        </w:tc>
-        <w:tc>
-          <w:tcPr>
-            <w:tcW w:type="dxa" w:w="1337"/>
-          </w:tcPr>
-          <w:p>
-            <w:r>
-              <w:t>1545.8</w:t>
-            </w:r>
-          </w:p>
-        </w:tc>
-        <w:tc>
-          <w:tcPr>
-            <w:tcW w:type="dxa" w:w="1337"/>
-          </w:tcPr>
-          <w:p>
-            <w:r>
-              <w:t>0.65</w:t>
-            </w:r>
-          </w:p>
-        </w:tc>
-        <w:tc>
-          <w:tcPr>
-            <w:tcW w:type="dxa" w:w="1337"/>
-          </w:tcPr>
-          <w:p>
-            <w:r>
-              <w:t>6.36x</w:t>
-            </w:r>
-          </w:p>
-        </w:tc>
-      </w:tr>
-      <w:tr>
-        <w:tc>
-          <w:tcPr>
-            <w:tcW w:type="dxa" w:w="1337"/>
-          </w:tcPr>
-          <w:p>
-            <w:r>
-              <w:t>2</w:t>
-            </w:r>
-          </w:p>
-        </w:tc>
-        <w:tc>
-          <w:tcPr>
-            <w:tcW w:type="dxa" w:w="1337"/>
-          </w:tcPr>
-          <w:p>
-            <w:r>
-              <w:t>1e-05</w:t>
-            </w:r>
-          </w:p>
-        </w:tc>
-        <w:tc>
-          <w:tcPr>
-            <w:tcW w:type="dxa" w:w="1337"/>
-          </w:tcPr>
-          <w:p>
-            <w:r>
-              <w:t>3</w:t>
-            </w:r>
-          </w:p>
-        </w:tc>
-        <w:tc>
-          <w:tcPr>
-            <w:tcW w:type="dxa" w:w="1337"/>
-          </w:tcPr>
-          <w:p>
-            <w:r>
-              <w:t>27.0%</w:t>
-            </w:r>
-          </w:p>
-        </w:tc>
-        <w:tc>
-          <w:tcPr>
-            <w:tcW w:type="dxa" w:w="1337"/>
-          </w:tcPr>
-          <w:p>
-            <w:r>
-              <w:t>1534.8</w:t>
-            </w:r>
-          </w:p>
-        </w:tc>
-        <w:tc>
-          <w:tcPr>
-            <w:tcW w:type="dxa" w:w="1337"/>
-          </w:tcPr>
-          <w:p>
-            <w:r>
-              <w:t>0.65</w:t>
-            </w:r>
-          </w:p>
-        </w:tc>
-        <w:tc>
-          <w:tcPr>
-            <w:tcW w:type="dxa" w:w="1337"/>
-          </w:tcPr>
-          <w:p>
-            <w:r>
-              <w:t>6.31x</w:t>
-            </w:r>
-          </w:p>
-        </w:tc>
-      </w:tr>
-      <w:tr>
-        <w:tc>
-          <w:tcPr>
-            <w:tcW w:type="dxa" w:w="1337"/>
-          </w:tcPr>
-          <w:p>
-            <w:r>
-              <w:t>2</w:t>
-            </w:r>
-          </w:p>
-        </w:tc>
-        <w:tc>
-          <w:tcPr>
-            <w:tcW w:type="dxa" w:w="1337"/>
-          </w:tcPr>
-          <w:p>
-            <w:r>
-              <w:t>1e-03</w:t>
-            </w:r>
-          </w:p>
-        </w:tc>
-        <w:tc>
-          <w:tcPr>
-            <w:tcW w:type="dxa" w:w="1337"/>
-          </w:tcPr>
-          <w:p>
-            <w:r>
-              <w:t>2</w:t>
-            </w:r>
-          </w:p>
-        </w:tc>
-        <w:tc>
-          <w:tcPr>
-            <w:tcW w:type="dxa" w:w="1337"/>
-          </w:tcPr>
-          <w:p>
-            <w:r>
-              <w:t>27.0%</w:t>
-            </w:r>
-          </w:p>
-        </w:tc>
-        <w:tc>
-          <w:tcPr>
-            <w:tcW w:type="dxa" w:w="1337"/>
-          </w:tcPr>
-          <w:p>
-            <w:r>
-              <w:t>1524.1</w:t>
-            </w:r>
-          </w:p>
-        </w:tc>
-        <w:tc>
-          <w:tcPr>
-            <w:tcW w:type="dxa" w:w="1337"/>
-          </w:tcPr>
-          <w:p>
-            <w:r>
-              <w:t>0.66</w:t>
-            </w:r>
-          </w:p>
-        </w:tc>
-        <w:tc>
-          <w:tcPr>
-            <w:tcW w:type="dxa" w:w="1337"/>
-          </w:tcPr>
-          <w:p>
-            <w:r>
-              <w:t>6.27x</w:t>
-            </w:r>
-          </w:p>
-        </w:tc>
-      </w:tr>
-      <w:tr>
-        <w:tc>
-          <w:tcPr>
-            <w:tcW w:type="dxa" w:w="1337"/>
-          </w:tcPr>
-          <w:p>
-            <w:r>
-              <w:t>2</w:t>
-            </w:r>
-          </w:p>
-        </w:tc>
-        <w:tc>
-          <w:tcPr>
-            <w:tcW w:type="dxa" w:w="1337"/>
-          </w:tcPr>
-          <w:p>
-            <w:r>
-              <w:t>1e-03</w:t>
-            </w:r>
-          </w:p>
-        </w:tc>
-        <w:tc>
-          <w:tcPr>
-            <w:tcW w:type="dxa" w:w="1337"/>
-          </w:tcPr>
-          <w:p>
-            <w:r>
-              <w:t>3</w:t>
-            </w:r>
-          </w:p>
-        </w:tc>
-        <w:tc>
-          <w:tcPr>
-            <w:tcW w:type="dxa" w:w="1337"/>
-          </w:tcPr>
-          <w:p>
-            <w:r>
-              <w:t>27.0%</w:t>
-            </w:r>
-          </w:p>
-        </w:tc>
-        <w:tc>
-          <w:tcPr>
-            <w:tcW w:type="dxa" w:w="1337"/>
-          </w:tcPr>
-          <w:p>
-            <w:r>
-              <w:t>1457.3</w:t>
-            </w:r>
-          </w:p>
-        </w:tc>
-        <w:tc>
-          <w:tcPr>
-            <w:tcW w:type="dxa" w:w="1337"/>
-          </w:tcPr>
-          <w:p>
-            <w:r>
-              <w:t>0.69</w:t>
-            </w:r>
-          </w:p>
-        </w:tc>
-        <w:tc>
-          <w:tcPr>
-            <w:tcW w:type="dxa" w:w="1337"/>
-          </w:tcPr>
-          <w:p>
-            <w:r>
-              <w:t>5.99x</w:t>
-            </w:r>
-          </w:p>
-        </w:tc>
-      </w:tr>
-      <w:tr>
-        <w:tc>
-          <w:tcPr>
-            <w:tcW w:type="dxa" w:w="1337"/>
-          </w:tcPr>
-          <w:p>
-            <w:r>
-              <w:t>2</w:t>
-            </w:r>
-          </w:p>
-        </w:tc>
-        <w:tc>
-          <w:tcPr>
-            <w:tcW w:type="dxa" w:w="1337"/>
-          </w:tcPr>
-          <w:p>
-            <w:r>
-              <w:t>1e-04</w:t>
-            </w:r>
-          </w:p>
-        </w:tc>
-        <w:tc>
-          <w:tcPr>
-            <w:tcW w:type="dxa" w:w="1337"/>
-          </w:tcPr>
-          <w:p>
-            <w:r>
-              <w:t>2</w:t>
-            </w:r>
-          </w:p>
-        </w:tc>
-        <w:tc>
-          <w:tcPr>
-            <w:tcW w:type="dxa" w:w="1337"/>
-          </w:tcPr>
-          <w:p>
-            <w:r>
-              <w:t>27.0%</w:t>
-            </w:r>
-          </w:p>
-        </w:tc>
-        <w:tc>
-          <w:tcPr>
-            <w:tcW w:type="dxa" w:w="1337"/>
-          </w:tcPr>
-          <w:p>
-            <w:r>
-              <w:t>1346.8</w:t>
-            </w:r>
-          </w:p>
-        </w:tc>
-        <w:tc>
-          <w:tcPr>
-            <w:tcW w:type="dxa" w:w="1337"/>
-          </w:tcPr>
-          <w:p>
-            <w:r>
-              <w:t>0.74</w:t>
-            </w:r>
-          </w:p>
-        </w:tc>
-        <w:tc>
-          <w:tcPr>
-            <w:tcW w:type="dxa" w:w="1337"/>
-          </w:tcPr>
-          <w:p>
-            <w:r>
-              <w:t>5.54x</w:t>
-            </w:r>
-          </w:p>
-        </w:tc>
-      </w:tr>
-      <w:tr>
-        <w:tc>
-          <w:tcPr>
-            <w:tcW w:type="dxa" w:w="1337"/>
-          </w:tcPr>
-          <w:p>
-            <w:r>
-              <w:t>3</w:t>
-            </w:r>
-          </w:p>
-        </w:tc>
-        <w:tc>
-          <w:tcPr>
-            <w:tcW w:type="dxa" w:w="1337"/>
-          </w:tcPr>
-          <w:p>
-            <w:r>
-              <w:t>1e-04</w:t>
-            </w:r>
-          </w:p>
-        </w:tc>
-        <w:tc>
-          <w:tcPr>
-            <w:tcW w:type="dxa" w:w="1337"/>
-          </w:tcPr>
-          <w:p>
-            <w:r>
-              <w:t>1</w:t>
-            </w:r>
-          </w:p>
-        </w:tc>
-        <w:tc>
-          <w:tcPr>
-            <w:tcW w:type="dxa" w:w="1337"/>
-          </w:tcPr>
-          <w:p>
-            <w:r>
-              <w:t>35.0%</w:t>
-            </w:r>
-          </w:p>
-        </w:tc>
-        <w:tc>
-          <w:tcPr>
-            <w:tcW w:type="dxa" w:w="1337"/>
-          </w:tcPr>
-          <w:p>
-            <w:r>
-              <w:t>1273.0</w:t>
-            </w:r>
-          </w:p>
-        </w:tc>
-        <w:tc>
-          <w:tcPr>
-            <w:tcW w:type="dxa" w:w="1337"/>
-          </w:tcPr>
-          <w:p>
-            <w:r>
-              <w:t>0.79</w:t>
-            </w:r>
-          </w:p>
-        </w:tc>
-        <w:tc>
-          <w:tcPr>
-            <w:tcW w:type="dxa" w:w="1337"/>
-          </w:tcPr>
-          <w:p>
-            <w:r>
-              <w:t>5.24x</w:t>
-            </w:r>
-          </w:p>
-        </w:tc>
-      </w:tr>
-      <w:tr>
-        <w:tc>
-          <w:tcPr>
-            <w:tcW w:type="dxa" w:w="1337"/>
-          </w:tcPr>
-          <w:p>
-            <w:r>
-              <w:t>3</w:t>
-            </w:r>
-          </w:p>
-        </w:tc>
-        <w:tc>
-          <w:tcPr>
-            <w:tcW w:type="dxa" w:w="1337"/>
-          </w:tcPr>
-          <w:p>
-            <w:r>
-              <w:t>1e-04</w:t>
-            </w:r>
-          </w:p>
-        </w:tc>
-        <w:tc>
-          <w:tcPr>
-            <w:tcW w:type="dxa" w:w="1337"/>
-          </w:tcPr>
-          <w:p>
-            <w:r>
-              <w:t>3</w:t>
-            </w:r>
-          </w:p>
-        </w:tc>
-        <w:tc>
-          <w:tcPr>
-            <w:tcW w:type="dxa" w:w="1337"/>
-          </w:tcPr>
-          <w:p>
-            <w:r>
-              <w:t>35.0%</w:t>
-            </w:r>
-          </w:p>
-        </w:tc>
-        <w:tc>
-          <w:tcPr>
-            <w:tcW w:type="dxa" w:w="1337"/>
-          </w:tcPr>
-          <w:p>
-            <w:r>
-              <w:t>1250.2</w:t>
-            </w:r>
-          </w:p>
-        </w:tc>
-        <w:tc>
-          <w:tcPr>
-            <w:tcW w:type="dxa" w:w="1337"/>
-          </w:tcPr>
-          <w:p>
-            <w:r>
-              <w:t>0.80</w:t>
-            </w:r>
-          </w:p>
-        </w:tc>
-        <w:tc>
-          <w:tcPr>
-            <w:tcW w:type="dxa" w:w="1337"/>
-          </w:tcPr>
-          <w:p>
-            <w:r>
-              <w:t>5.14x</w:t>
-            </w:r>
-          </w:p>
-        </w:tc>
-      </w:tr>
-    </w:tbl>
     <w:sectPr>
       <w:pgSz w:w="12240" w:h="15840"/>
       <w:pgMar w:top="1440" w:right="1440" w:bottom="1440" w:left="1440" w:header="720" w:footer="720" w:gutter="0"/>
@@ -25466,4 +24794,16 @@
   </a:objectDefaults>
   <a:extraClrSchemeLst/>
 </a:theme>
+</file>
+
+<file path=customXml/item1.xml><?xml version="1.0" encoding="utf-8"?>
+<b:Sources xmlns:b="http://schemas.openxmlformats.org/officeDocument/2006/bibliography" xmlns="http://schemas.openxmlformats.org/officeDocument/2006/bibliography" SelectedStyle="/APA.XSL" StyleName="APA"/>
+</file>
+
+<file path=customXml/itemProps1.xml><?xml version="1.0" encoding="utf-8"?>
+<ds:datastoreItem xmlns:ds="http://schemas.openxmlformats.org/officeDocument/2006/customXml" ds:itemID="{EF278816-EC6F-A645-907D-7F25AECB1D4A}">
+  <ds:schemaRefs>
+    <ds:schemaRef ds:uri="http://schemas.openxmlformats.org/officeDocument/2006/bibliography"/>
+  </ds:schemaRefs>
+</ds:datastoreItem>
 </file>
</xml_diff>